<commit_message>
Publica template Taubaté por Pedro
</commit_message>
<xml_diff>
--- a/templates/taubate.docx
+++ b/templates/taubate.docx
@@ -78,7 +78,31 @@
         <w:jc w:val="both"/>
       </w:pPr>
       <w:r>
+        <w:rPr>
+          <w:rFonts w:ascii="Arial" w:hAnsi="Arial" w:eastAsia="Arial" w:cs="Arial"/>
+          <w:sz w:val="20"/>
+        </w:rPr>
+      </w:r>
+    </w:p>
+    <w:p>
+      <w:pPr>
+        <w:spacing w:before="0" w:after="0" w:line="240" w:lineRule="auto"/>
+        <w:jc w:val="both"/>
+      </w:pPr>
+      <w:r>
         <w:t>Declaramos que a empresa {{EMPRESA}} - {{CNPJ}} tendo contratado {{BLOCO_BENEFICIOS}}, os quais atendem na íntegra a CLÁUSULA CESTA DE BENEFÍCIOS.</w:t>
+      </w:r>
+    </w:p>
+    <w:p>
+      <w:pPr>
+        <w:spacing w:before="0" w:after="0" w:line="240" w:lineRule="auto"/>
+        <w:jc w:val="both"/>
+      </w:pPr>
+      <w:r>
+        <w:rPr>
+          <w:rFonts w:ascii="Arial" w:hAnsi="Arial" w:eastAsia="Arial" w:cs="Arial"/>
+          <w:sz w:val="20"/>
+        </w:rPr>
       </w:r>
     </w:p>
     <w:p>
@@ -93,6 +117,18 @@
           <w:sz w:val="20"/>
         </w:rPr>
         <w:t>Informamos que a apólice do Seguro de Vida, assim como o Resumo de Fatura do Plano Odontológico e as respectivas carteirinhas, estão atualmente em processo de emissão junto à Seguradora. Tão logo estejam disponíveis, serão prontamente encaminhados ao e-mail do nosso estimado cliente.</w:t>
+      </w:r>
+    </w:p>
+    <w:p>
+      <w:pPr>
+        <w:spacing w:before="0" w:after="0" w:line="240" w:lineRule="auto"/>
+        <w:jc w:val="both"/>
+      </w:pPr>
+      <w:r>
+        <w:rPr>
+          <w:rFonts w:ascii="Arial" w:hAnsi="Arial" w:eastAsia="Arial" w:cs="Arial"/>
+          <w:sz w:val="20"/>
+        </w:rPr>
       </w:r>
     </w:p>
     <w:p>

</xml_diff>